<commit_message>
Finalize manuscript presentation and printable supplements
</commit_message>
<xml_diff>
--- a/reports/information/monitoring_information_increment.docx
+++ b/reports/information/monitoring_information_increment.docx
@@ -25,6 +25,16 @@
       </w:pPr>
       <w:r>
         <w:t>Question and matched comparison</w:t>
+      </w:r>
+    </w:p>
+    <w:p>
+      <w:r>
+        <w:t>This study uses the audited UCI Seismic Bumps mirror containing 2,578 records. A hazardous-shift label indicates a seismic bump with energy above 10,000 J in the subsequent eight-hour shift. It identifies a hazardous shift, not an observed accident or an avoided accident. Recorded order is a temporal proxy because timestamps and working-face identifiers are unavailable.</w:t>
+      </w:r>
+    </w:p>
+    <w:p>
+      <w:r>
+        <w:t>The primary seismic assessment orders a (no hazard), b (low hazard), c (high hazard) and d (danger state). The mirror contains only a, b for this field; c and d are defined levels but are not observed here. Average precision (AP) is the sum of precision values weighted by recall increments, evaluating tied scores as a group. It selects historical model configurations and is distinct from the detection counts evaluated at fixed inspection slots.</w:t>
       </w:r>
     </w:p>
     <w:p>
@@ -2749,8 +2759,73 @@
     </w:p>
     <w:p>
       <w:r>
-        <w:t>The separate protocol is phase2/information/protocol.json. Model fitting and analytic allocation are implemented in phase2/information/run.py; phase2/information/verify.py recomputes the evidence through a separate calculation path and supports full refitting replay. Results in results/phase2/information/ retain row-level scores and inclusion probabilities, all candidate tuning predictions, eight final models, grade allocations, every bootstrap multiplicity and replicate, and version-specific verification. The original stage-specific papers and ranking-pilot experimental results are retained. The integrated report includes the main matched-information finding; this supplement retains the complete design, table and block-length sensitivity. Author contributions and AI assistance follow CONTRIBUTIONS.md.</w:t>
+        <w:t>The protocol, fitting and allocation code, numerical verifier and saved evidence are linked below. The verifier recomputes the calculations through a separate path and supports full refitting replay. Retained results include row-level scores and inclusion probabilities, all candidate tuning predictions, eight final models, grade allocations, every bootstrap multiplicity and replicate, and version-specific verification. The original stage-specific papers and ranking-pilot experimental results are retained. The integrated report includes the main matched-information finding; this supplement retains the complete design, table and block-length sensitivity.</w:t>
       </w:r>
+    </w:p>
+    <w:p>
+      <w:r>
+        <w:t>Scientific code and saved-evidence links identify commit de83319. The integrated-manuscript link identifies the fixed presentation edition manuscript-2026-10-25. This revised report is generated by the current reporting code; its presentation is not claimed to be part of the earlier scientific source edition.</w:t>
+      </w:r>
+    </w:p>
+    <w:p>
+      <w:hyperlink r:id="rId9">
+        <w:r>
+          <w:t>UCI dataset and target definition</w:t>
+        </w:r>
+      </w:hyperlink>
+      <w:r>
+        <w:t xml:space="preserve"> | </w:t>
+      </w:r>
+      <w:hyperlink r:id="rId10">
+        <w:r>
+          <w:t>Audited source and row mapping</w:t>
+        </w:r>
+      </w:hyperlink>
+    </w:p>
+    <w:p>
+      <w:hyperlink r:id="rId11">
+        <w:r>
+          <w:t>Matched-information protocol</w:t>
+        </w:r>
+      </w:hyperlink>
+      <w:r>
+        <w:t xml:space="preserve"> | </w:t>
+      </w:r>
+      <w:hyperlink r:id="rId12">
+        <w:r>
+          <w:t>Model fitting and within-grade allocation</w:t>
+        </w:r>
+      </w:hyperlink>
+    </w:p>
+    <w:p>
+      <w:hyperlink r:id="rId13">
+        <w:r>
+          <w:t>Numerical verification and refit replay</w:t>
+        </w:r>
+      </w:hyperlink>
+      <w:r>
+        <w:t xml:space="preserve"> | </w:t>
+      </w:r>
+      <w:hyperlink r:id="rId14">
+        <w:r>
+          <w:t>Saved results and verification guide</w:t>
+        </w:r>
+      </w:hyperlink>
+    </w:p>
+    <w:p>
+      <w:hyperlink r:id="rId15">
+        <w:r>
+          <w:t>Integrated manuscript in this edition</w:t>
+        </w:r>
+      </w:hyperlink>
+      <w:r>
+        <w:t xml:space="preserve"> | </w:t>
+      </w:r>
+      <w:hyperlink r:id="rId16">
+        <w:r>
+          <w:t>Author contributions and AI assistance</w:t>
+        </w:r>
+      </w:hyperlink>
     </w:p>
     <w:p>
       <w:pPr>
@@ -2768,7 +2843,7 @@
       <w:r>
         <w:drawing>
           <wp:inline xmlns:a="http://schemas.openxmlformats.org/drawingml/2006/main" xmlns:pic="http://schemas.openxmlformats.org/drawingml/2006/picture">
-            <wp:extent cx="5852160" cy="5947773"/>
+            <wp:extent cx="5486400" cy="5565174"/>
             <wp:docPr id="1" name="Picture 1"/>
             <wp:cNvGraphicFramePr>
               <a:graphicFrameLocks noChangeAspect="1"/>
@@ -2781,7 +2856,13 @@
                     <pic:cNvPicPr/>
                   </pic:nvPicPr>
                   <pic:blipFill>
-                    <a:blip r:embed="rId9"/>
+                    <a:blip r:embed="rId17">
+                      <a:extLst>
+                        <a:ext uri="{96DAC541-7B7A-43D3-8B79-37D633B846F1}">
+                          <asvg:svgBlip xmlns:asvg="http://schemas.microsoft.com/office/drawing/2016/SVG/main" r:embed="rId18"/>
+                        </a:ext>
+                      </a:extLst>
+                    </a:blip>
                     <a:stretch>
                       <a:fillRect/>
                     </a:stretch>
@@ -2789,7 +2870,7 @@
                   <pic:spPr>
                     <a:xfrm>
                       <a:off x="0" y="0"/>
-                      <a:ext cx="5852160" cy="5947773"/>
+                      <a:ext cx="5486400" cy="5565174"/>
                     </a:xfrm>
                     <a:prstGeom prst="rect"/>
                   </pic:spPr>
@@ -2810,7 +2891,7 @@
       </w:r>
     </w:p>
     <w:sectPr>
-      <w:footerReference w:type="default" r:id="rId10"/>
+      <w:footerReference w:type="default" r:id="rId19"/>
       <w:pgSz w:w="11909" w:h="16834"/>
       <w:pgMar w:top="1080" w:right="1152" w:bottom="1080" w:left="1152" w:header="720" w:footer="720" w:gutter="0"/>
       <w:cols w:space="720"/>

</xml_diff>

<commit_message>
Clarify expected detections and align manuscript navigation
</commit_message>
<xml_diff>
--- a/reports/information/monitoring_information_increment.docx
+++ b/reports/information/monitoring_information_increment.docx
@@ -43,9 +43,236 @@
       </w:r>
     </w:p>
     <w:p>
+      <w:pPr>
+        <w:keepNext/>
+      </w:pPr>
       <w:r>
-        <w:t>Within each test block, K=floor(B*N) slots go to higher seismic grades first; model scores rank records within each grade. Both models use uniform allocation within an exactly tied boundary score group: h slots among m records containing p hazards contribute E(TP)=h*p/m. Reported fractional counts integrate allocation randomness rather than describe fractional shifts. Pooled results sum block allocations; scores are never ranked across fitted blocks.</w:t>
+        <w:t>Within each test block, K=floor(B*N) slots go to higher seismic grades first; model scores rank records within each grade. Both models use uniform allocation within an exactly tied boundary score group: h slots among m records containing p hazards contribute the boundary expectation below. Total expected detections add TP from all fully selected grade-score groups. Without a partially selected group, the boundary contribution is zero. Pooled total expectations sum block totals; scores are never ranked across fitted blocks. Fractional counts integrate allocation randomness.</w:t>
       </w:r>
+    </w:p>
+    <w:p>
+      <w:pPr>
+        <w:keepNext/>
+        <w:keepLines/>
+        <w:jc w:val="center"/>
+      </w:pPr>
+      <m:oMath>
+        <m:r>
+          <m:rPr>
+            <m:nor m:val="1"/>
+          </m:rPr>
+          <w:rPr>
+            <w:rFonts w:ascii="Cambria Math" w:hAnsi="Cambria Math"/>
+          </w:rPr>
+          <m:t>E</m:t>
+        </m:r>
+        <m:d>
+          <m:dPr>
+            <m:begChr m:val="("/>
+            <m:endChr m:val=")"/>
+          </m:dPr>
+          <m:e>
+            <m:sSub>
+              <m:e>
+                <m:r>
+                  <m:rPr>
+                    <m:nor m:val="1"/>
+                  </m:rPr>
+                  <w:rPr>
+                    <w:rFonts w:ascii="Cambria Math" w:hAnsi="Cambria Math"/>
+                  </w:rPr>
+                  <m:t>TP</m:t>
+                </m:r>
+              </m:e>
+              <m:sub>
+                <m:r>
+                  <m:rPr>
+                    <m:nor m:val="1"/>
+                  </m:rPr>
+                  <w:rPr>
+                    <w:rFonts w:ascii="Cambria Math" w:hAnsi="Cambria Math"/>
+                  </w:rPr>
+                  <m:t>boundary</m:t>
+                </m:r>
+              </m:sub>
+            </m:sSub>
+          </m:e>
+        </m:d>
+        <m:r>
+          <m:rPr>
+            <m:nor m:val="1"/>
+          </m:rPr>
+          <w:rPr>
+            <w:rFonts w:ascii="Cambria Math" w:hAnsi="Cambria Math"/>
+          </w:rPr>
+          <m:t>=</m:t>
+        </m:r>
+        <m:f>
+          <m:num>
+            <m:r>
+              <m:rPr>
+                <m:nor m:val="1"/>
+              </m:rPr>
+              <w:rPr>
+                <w:rFonts w:ascii="Cambria Math" w:hAnsi="Cambria Math"/>
+              </w:rPr>
+              <m:t>h</m:t>
+            </m:r>
+            <m:r>
+              <m:rPr>
+                <m:nor m:val="1"/>
+              </m:rPr>
+              <w:rPr>
+                <w:rFonts w:ascii="Cambria Math" w:hAnsi="Cambria Math"/>
+              </w:rPr>
+              <m:t>p</m:t>
+            </m:r>
+          </m:num>
+          <m:den>
+            <m:r>
+              <m:rPr>
+                <m:nor m:val="1"/>
+              </m:rPr>
+              <w:rPr>
+                <w:rFonts w:ascii="Cambria Math" w:hAnsi="Cambria Math"/>
+              </w:rPr>
+              <m:t>m</m:t>
+            </m:r>
+          </m:den>
+        </m:f>
+      </m:oMath>
+    </w:p>
+    <w:p>
+      <w:pPr>
+        <w:keepLines/>
+        <w:jc w:val="center"/>
+      </w:pPr>
+      <m:oMath>
+        <m:r>
+          <m:rPr>
+            <m:nor m:val="1"/>
+          </m:rPr>
+          <w:rPr>
+            <w:rFonts w:ascii="Cambria Math" w:hAnsi="Cambria Math"/>
+          </w:rPr>
+          <m:t>E</m:t>
+        </m:r>
+        <m:d>
+          <m:dPr>
+            <m:begChr m:val="("/>
+            <m:endChr m:val=")"/>
+          </m:dPr>
+          <m:e>
+            <m:sSub>
+              <m:e>
+                <m:r>
+                  <m:rPr>
+                    <m:nor m:val="1"/>
+                  </m:rPr>
+                  <w:rPr>
+                    <w:rFonts w:ascii="Cambria Math" w:hAnsi="Cambria Math"/>
+                  </w:rPr>
+                  <m:t>TP</m:t>
+                </m:r>
+              </m:e>
+              <m:sub>
+                <m:r>
+                  <m:rPr>
+                    <m:nor m:val="1"/>
+                  </m:rPr>
+                  <w:rPr>
+                    <w:rFonts w:ascii="Cambria Math" w:hAnsi="Cambria Math"/>
+                  </w:rPr>
+                  <m:t>total</m:t>
+                </m:r>
+              </m:sub>
+            </m:sSub>
+          </m:e>
+        </m:d>
+        <m:r>
+          <m:rPr>
+            <m:nor m:val="1"/>
+          </m:rPr>
+          <w:rPr>
+            <w:rFonts w:ascii="Cambria Math" w:hAnsi="Cambria Math"/>
+          </w:rPr>
+          <m:t>=</m:t>
+        </m:r>
+        <m:sSub>
+          <m:e>
+            <m:r>
+              <m:rPr>
+                <m:nor m:val="1"/>
+              </m:rPr>
+              <w:rPr>
+                <w:rFonts w:ascii="Cambria Math" w:hAnsi="Cambria Math"/>
+              </w:rPr>
+              <m:t>TP</m:t>
+            </m:r>
+          </m:e>
+          <m:sub>
+            <m:r>
+              <m:rPr>
+                <m:nor m:val="1"/>
+              </m:rPr>
+              <w:rPr>
+                <w:rFonts w:ascii="Cambria Math" w:hAnsi="Cambria Math"/>
+              </w:rPr>
+              <m:t xml:space="preserve">fully selected</m:t>
+            </m:r>
+          </m:sub>
+        </m:sSub>
+        <m:r>
+          <m:rPr>
+            <m:nor m:val="1"/>
+          </m:rPr>
+          <w:rPr>
+            <w:rFonts w:ascii="Cambria Math" w:hAnsi="Cambria Math"/>
+          </w:rPr>
+          <m:t>+</m:t>
+        </m:r>
+        <m:r>
+          <m:rPr>
+            <m:nor m:val="1"/>
+          </m:rPr>
+          <w:rPr>
+            <w:rFonts w:ascii="Cambria Math" w:hAnsi="Cambria Math"/>
+          </w:rPr>
+          <m:t>E</m:t>
+        </m:r>
+        <m:d>
+          <m:dPr>
+            <m:begChr m:val="("/>
+            <m:endChr m:val=")"/>
+          </m:dPr>
+          <m:e>
+            <m:sSub>
+              <m:e>
+                <m:r>
+                  <m:rPr>
+                    <m:nor m:val="1"/>
+                  </m:rPr>
+                  <w:rPr>
+                    <w:rFonts w:ascii="Cambria Math" w:hAnsi="Cambria Math"/>
+                  </w:rPr>
+                  <m:t>TP</m:t>
+                </m:r>
+              </m:e>
+              <m:sub>
+                <m:r>
+                  <m:rPr>
+                    <m:nor m:val="1"/>
+                  </m:rPr>
+                  <w:rPr>
+                    <w:rFonts w:ascii="Cambria Math" w:hAnsi="Cambria Math"/>
+                  </w:rPr>
+                  <m:t>boundary</m:t>
+                </m:r>
+              </m:sub>
+            </m:sSub>
+          </m:e>
+        </m:d>
+      </m:oMath>
     </w:p>
     <w:p>
       <w:pPr>
@@ -2745,9 +2972,176 @@
       </w:r>
     </w:p>
     <w:p>
+      <w:pPr>
+        <w:keepNext/>
+      </w:pPr>
       <w:r>
-        <w:t>The matched baseline changes the interpretation of the earlier complete-score-versus-grade-random pilot: the present increment is specifically relative to a fitted model already using all three assessments and shift type. Positive point differences occur in 3/4, 0/4, 2/4, 4/4 budgets in blocks 1-4, respectively; 16/16 main block-specific intervals include zero. The pooled intervals also include zero at every budget and block length, so these observations do not resolve a consistent monitoring-information increment under the specified workflow. This does not establish that monitoring information is generally uninformative: the comparison concerns these inputs, separately AP-selected configurations and previously examined records. At fixed P and K, E(L)=r*P+K-(r+1)*E(TP), so an additional cost grid would restate detection differences. Recorded order remains a temporal proxy, and the batch allocation is not an observed inspection process or accident-prevention effect. Independent timestamped working-face data with inspection outcomes would test transfer beyond this cohort.</w:t>
+        <w:t>The matched baseline changes the interpretation of the earlier complete-score-versus-grade-random pilot: the present increment is specifically relative to a fitted model already using all three assessments and shift type. Positive point differences occur in 3/4, 0/4, 2/4, 4/4 budgets in blocks 1-4, respectively; 16/16 main block-specific intervals include zero. The pooled intervals also include zero at every budget and block length, so these observations do not resolve a consistent monitoring-information increment under the specified workflow. This does not establish that monitoring information is generally uninformative: the comparison concerns these inputs, separately AP-selected configurations and previously examined records. At fixed hazardous count P and allocated slots K, expected loss uses the total expected detections as shown below; an additional cost grid would restate detection differences. Recorded order remains a temporal proxy, and the batch allocation is not an observed inspection process or accident-prevention effect. Independent timestamped working-face data with inspection outcomes would test transfer beyond this cohort.</w:t>
       </w:r>
+    </w:p>
+    <w:p>
+      <w:pPr>
+        <w:keepLines/>
+        <w:jc w:val="center"/>
+      </w:pPr>
+      <m:oMath>
+        <m:r>
+          <m:rPr>
+            <m:nor m:val="1"/>
+          </m:rPr>
+          <w:rPr>
+            <w:rFonts w:ascii="Cambria Math" w:hAnsi="Cambria Math"/>
+          </w:rPr>
+          <m:t>E</m:t>
+        </m:r>
+        <m:d>
+          <m:dPr>
+            <m:begChr m:val="("/>
+            <m:endChr m:val=")"/>
+          </m:dPr>
+          <m:e>
+            <m:r>
+              <m:rPr>
+                <m:nor m:val="1"/>
+              </m:rPr>
+              <w:rPr>
+                <w:rFonts w:ascii="Cambria Math" w:hAnsi="Cambria Math"/>
+              </w:rPr>
+              <m:t>L</m:t>
+            </m:r>
+          </m:e>
+        </m:d>
+        <m:r>
+          <m:rPr>
+            <m:nor m:val="1"/>
+          </m:rPr>
+          <w:rPr>
+            <w:rFonts w:ascii="Cambria Math" w:hAnsi="Cambria Math"/>
+          </w:rPr>
+          <m:t>=</m:t>
+        </m:r>
+        <m:r>
+          <m:rPr>
+            <m:nor m:val="1"/>
+          </m:rPr>
+          <w:rPr>
+            <w:rFonts w:ascii="Cambria Math" w:hAnsi="Cambria Math"/>
+          </w:rPr>
+          <m:t>r</m:t>
+        </m:r>
+        <m:r>
+          <m:rPr>
+            <m:nor m:val="1"/>
+          </m:rPr>
+          <w:rPr>
+            <w:rFonts w:ascii="Cambria Math" w:hAnsi="Cambria Math"/>
+          </w:rPr>
+          <m:t>P</m:t>
+        </m:r>
+        <m:r>
+          <m:rPr>
+            <m:nor m:val="1"/>
+          </m:rPr>
+          <w:rPr>
+            <w:rFonts w:ascii="Cambria Math" w:hAnsi="Cambria Math"/>
+          </w:rPr>
+          <m:t>+</m:t>
+        </m:r>
+        <m:r>
+          <m:rPr>
+            <m:nor m:val="1"/>
+          </m:rPr>
+          <w:rPr>
+            <w:rFonts w:ascii="Cambria Math" w:hAnsi="Cambria Math"/>
+          </w:rPr>
+          <m:t>K</m:t>
+        </m:r>
+        <m:r>
+          <m:rPr>
+            <m:nor m:val="1"/>
+          </m:rPr>
+          <w:rPr>
+            <w:rFonts w:ascii="Cambria Math" w:hAnsi="Cambria Math"/>
+          </w:rPr>
+          <m:t>−</m:t>
+        </m:r>
+        <m:d>
+          <m:dPr>
+            <m:begChr m:val="("/>
+            <m:endChr m:val=")"/>
+          </m:dPr>
+          <m:e>
+            <m:r>
+              <m:rPr>
+                <m:nor m:val="1"/>
+              </m:rPr>
+              <w:rPr>
+                <w:rFonts w:ascii="Cambria Math" w:hAnsi="Cambria Math"/>
+              </w:rPr>
+              <m:t>r</m:t>
+            </m:r>
+            <m:r>
+              <m:rPr>
+                <m:nor m:val="1"/>
+              </m:rPr>
+              <w:rPr>
+                <w:rFonts w:ascii="Cambria Math" w:hAnsi="Cambria Math"/>
+              </w:rPr>
+              <m:t>+</m:t>
+            </m:r>
+            <m:r>
+              <m:rPr>
+                <m:nor m:val="1"/>
+              </m:rPr>
+              <w:rPr>
+                <w:rFonts w:ascii="Cambria Math" w:hAnsi="Cambria Math"/>
+              </w:rPr>
+              <m:t>1</m:t>
+            </m:r>
+          </m:e>
+        </m:d>
+        <m:r>
+          <m:rPr>
+            <m:nor m:val="1"/>
+          </m:rPr>
+          <w:rPr>
+            <w:rFonts w:ascii="Cambria Math" w:hAnsi="Cambria Math"/>
+          </w:rPr>
+          <m:t>E</m:t>
+        </m:r>
+        <m:d>
+          <m:dPr>
+            <m:begChr m:val="("/>
+            <m:endChr m:val=")"/>
+          </m:dPr>
+          <m:e>
+            <m:sSub>
+              <m:e>
+                <m:r>
+                  <m:rPr>
+                    <m:nor m:val="1"/>
+                  </m:rPr>
+                  <w:rPr>
+                    <w:rFonts w:ascii="Cambria Math" w:hAnsi="Cambria Math"/>
+                  </w:rPr>
+                  <m:t>TP</m:t>
+                </m:r>
+              </m:e>
+              <m:sub>
+                <m:r>
+                  <m:rPr>
+                    <m:nor m:val="1"/>
+                  </m:rPr>
+                  <w:rPr>
+                    <w:rFonts w:ascii="Cambria Math" w:hAnsi="Cambria Math"/>
+                  </w:rPr>
+                  <m:t>total</m:t>
+                </m:r>
+              </m:sub>
+            </m:sSub>
+          </m:e>
+        </m:d>
+      </m:oMath>
     </w:p>
     <w:p>
       <w:pPr>
@@ -2764,7 +3158,7 @@
     </w:p>
     <w:p>
       <w:r>
-        <w:t>Scientific code and saved-evidence links identify commit de83319. The integrated-manuscript link identifies the fixed presentation edition manuscript-2026-10-25. This revised report is generated by the current reporting code; its presentation is not claimed to be part of the earlier scientific source edition.</w:t>
+        <w:t>Scientific code and saved-evidence links identify commit de83319. The integrated-manuscript link identifies the fixed presentation edition manuscript-2026-10-26. This revised report is generated by the current reporting code; its presentation is not claimed to be part of the earlier scientific source edition.</w:t>
       </w:r>
     </w:p>
     <w:p>
@@ -2843,7 +3237,7 @@
       <w:r>
         <w:drawing>
           <wp:inline xmlns:a="http://schemas.openxmlformats.org/drawingml/2006/main" xmlns:pic="http://schemas.openxmlformats.org/drawingml/2006/picture">
-            <wp:extent cx="5486400" cy="5565174"/>
+            <wp:extent cx="5212080" cy="5286916"/>
             <wp:docPr id="1" name="Picture 1"/>
             <wp:cNvGraphicFramePr>
               <a:graphicFrameLocks noChangeAspect="1"/>
@@ -2870,7 +3264,7 @@
                   <pic:spPr>
                     <a:xfrm>
                       <a:off x="0" y="0"/>
-                      <a:ext cx="5486400" cy="5565174"/>
+                      <a:ext cx="5212080" cy="5286916"/>
                     </a:xfrm>
                     <a:prstGeom prst="rect"/>
                   </pic:spPr>

</xml_diff>